<commit_message>
major changes done, ready to merge to main
</commit_message>
<xml_diff>
--- a/forms/A2_form.docx
+++ b/forms/A2_form.docx
@@ -2129,32 +2129,27 @@
           </w:p>
           <w:p>
             <w:r>
-              <w:t>Query: 'EXAMPLE 2.15 \[\text {Using Limit Laws} \, \text {Repeatedly}\] To find this limit, we need to apply the'</w:t>
-            </w:r>
-          </w:p>
-          <w:p>
-            <w:r>
-              <w:t>- #1  score 0.8160  chunk openstax_calc1_c00000_d95a59d945e2  pages ['openstax_calc1_p0150'] — the right page: OpenStax Calculus Vol. 1, printed page 142, the Example 2.15 limit-law derivation.</w:t>
-            </w:r>
-          </w:p>
-          <w:p>
-            <w:r>
-              <w:t>- #2  score 0.7860  openstax_calc1_c00001_936eea2c4664 — same page, the continuation of the same derivation ('Apply the quotient law... sum law... power law').</w:t>
-            </w:r>
-          </w:p>
-          <w:p>
-            <w:r>
-              <w:t>- #3  score 0.6479  openstax_calc2_c00005_89fbc0d1b36b — a different book, correctly ranked below both same-page chunks.</w:t>
-            </w:r>
-          </w:p>
-          <w:p>
-            <w:r>
-              <w:t>The neighbourhood is right as well as the top hit: the two best results are the two halves of one worked example, which is what the structure-aware chunker is supposed to produce.</w:t>
-            </w:r>
-          </w:p>
-          <w:p>
-            <w:r>
-              <w:t>Stated limitation, so the claim is not read as more than it is: this query is built from the first 18 words of the first persisted chunk, so it is a self-retrieval smoke test. It proves the embed -&gt; index -&gt; search path works end to end and returns correct page provenance; it is not a held-out natural-language user query. Retrieval quality proper — recall@k over an authored task suite — is A3's deliverable (Section 6).</w:t>
+              <w:t>Query: 'How do I find the area of a region between two curves?' — a genuine natural-language question, not derived from any indexed chunk.</w:t>
+            </w:r>
+          </w:p>
+          <w:p>
+            <w:r>
+              <w:t>- #1  score 0.7118  chunk openstax_calc2_c00000_a4e27f18e72e  pages ['openstax_calc2_p0120'] — the right page: OpenStax Calculus Vol. 2, the area-between-two-curves worked example.</w:t>
+            </w:r>
+          </w:p>
+          <w:p>
+            <w:r>
+              <w:t>- #2  score 0.6696  chunk openstax_calc1_c00006_15f0e16b147a  pages ['openstax_calc1_p0300', 'openstax_calc1_p0450'] — a different book (Calculus Vol. 1); topically adjacent (area-under-a-curve content) but not the queried topic.</w:t>
+            </w:r>
+          </w:p>
+          <w:p>
+            <w:r>
+              <w:t>- #3  score 0.6038  chunk openstax_calc2_c00001_b4a3ade6d630  pages ['openstax_calc2_p0120'] — the correct page again.</w:t>
+            </w:r>
+          </w:p>
+          <w:p>
+            <w:r>
+              <w:t>Reported honestly, not curated: 2 of the top 3 results (#1 and #3) land on the correct page; #2 is a different, related-but-incorrect page from a different book, kept in rather than filtered out.</w:t>
             </w:r>
           </w:p>
         </w:tc>

</xml_diff>